<commit_message>
Manuals: mu-Tant screenshots refreshed from Release v1.1.0.1450 (all 17 images), manual regenerated
Co-Authored-By: Claude Sonnet 5.5 <noreply@anthropic.com>
</commit_message>
<xml_diff>
--- a/docs/mu-tant/mu-Tant User Manual.docx
+++ b/docs/mu-tant/mu-Tant User Manual.docx
@@ -89,10 +89,10 @@
           <w:noProof/>
         </w:rPr>
         <w:drawing>
-          <wp:inline distT="0" distB="0" distL="0" distR="0" wp14:anchorId="678AD700" wp14:editId="12CE4653">
+          <wp:inline distT="0" distB="0" distL="0" distR="0" wp14:anchorId="37EA989B" wp14:editId="75F5F247">
             <wp:extent cx="5274310" cy="3340100"/>
             <wp:effectExtent l="0" t="0" r="2540" b="0"/>
-            <wp:docPr id="1548366546" name="Picture 1"/>
+            <wp:docPr id="416482572" name="Picture 1"/>
             <wp:cNvGraphicFramePr>
               <a:graphicFrameLocks xmlns:a="http://schemas.openxmlformats.org/drawingml/2006/main" noChangeAspect="1"/>
             </wp:cNvGraphicFramePr>
@@ -100,7 +100,7 @@
               <a:graphicData uri="http://schemas.openxmlformats.org/drawingml/2006/picture">
                 <pic:pic xmlns:pic="http://schemas.openxmlformats.org/drawingml/2006/picture">
                   <pic:nvPicPr>
-                    <pic:cNvPr id="1548366546" name=""/>
+                    <pic:cNvPr id="416482572" name=""/>
                     <pic:cNvPicPr/>
                   </pic:nvPicPr>
                   <pic:blipFill>
@@ -317,10 +317,10 @@
           <w:noProof/>
         </w:rPr>
         <w:drawing>
-          <wp:inline distT="0" distB="0" distL="0" distR="0" wp14:anchorId="70155CFB" wp14:editId="7B129440">
+          <wp:inline distT="0" distB="0" distL="0" distR="0" wp14:anchorId="096E0338" wp14:editId="04F995D6">
             <wp:extent cx="5274310" cy="3340100"/>
             <wp:effectExtent l="0" t="0" r="2540" b="0"/>
-            <wp:docPr id="936887891" name="Picture 2"/>
+            <wp:docPr id="2032101635" name="Picture 2"/>
             <wp:cNvGraphicFramePr>
               <a:graphicFrameLocks xmlns:a="http://schemas.openxmlformats.org/drawingml/2006/main" noChangeAspect="1"/>
             </wp:cNvGraphicFramePr>
@@ -328,7 +328,7 @@
               <a:graphicData uri="http://schemas.openxmlformats.org/drawingml/2006/picture">
                 <pic:pic xmlns:pic="http://schemas.openxmlformats.org/drawingml/2006/picture">
                   <pic:nvPicPr>
-                    <pic:cNvPr id="936887891" name=""/>
+                    <pic:cNvPr id="2032101635" name=""/>
                     <pic:cNvPicPr/>
                   </pic:nvPicPr>
                   <pic:blipFill>
@@ -377,10 +377,10 @@
         </w:rPr>
         <w:lastRenderedPageBreak/>
         <w:drawing>
-          <wp:inline distT="0" distB="0" distL="0" distR="0" wp14:anchorId="47128ADF" wp14:editId="4D2E233D">
-            <wp:extent cx="4002118" cy="3049232"/>
+          <wp:inline distT="0" distB="0" distL="0" distR="0" wp14:anchorId="0EF2E05B" wp14:editId="06EA8A11">
+            <wp:extent cx="4001058" cy="3048425"/>
             <wp:effectExtent l="0" t="0" r="0" b="0"/>
-            <wp:docPr id="180432864" name="Picture 3"/>
+            <wp:docPr id="992787558" name="Picture 3"/>
             <wp:cNvGraphicFramePr>
               <a:graphicFrameLocks xmlns:a="http://schemas.openxmlformats.org/drawingml/2006/main" noChangeAspect="1"/>
             </wp:cNvGraphicFramePr>
@@ -388,7 +388,7 @@
               <a:graphicData uri="http://schemas.openxmlformats.org/drawingml/2006/picture">
                 <pic:pic xmlns:pic="http://schemas.openxmlformats.org/drawingml/2006/picture">
                   <pic:nvPicPr>
-                    <pic:cNvPr id="180432864" name=""/>
+                    <pic:cNvPr id="992787558" name=""/>
                     <pic:cNvPicPr/>
                   </pic:nvPicPr>
                   <pic:blipFill>
@@ -406,7 +406,7 @@
                   <pic:spPr>
                     <a:xfrm>
                       <a:off x="0" y="0"/>
-                      <a:ext cx="4002118" cy="3049232"/>
+                      <a:ext cx="4001058" cy="3048425"/>
                     </a:xfrm>
                     <a:prstGeom prst="rect">
                       <a:avLst/>
@@ -495,10 +495,10 @@
         </w:rPr>
         <w:lastRenderedPageBreak/>
         <w:drawing>
-          <wp:inline distT="0" distB="0" distL="0" distR="0" wp14:anchorId="1D120DFB" wp14:editId="493B17F3">
+          <wp:inline distT="0" distB="0" distL="0" distR="0" wp14:anchorId="15C900FB" wp14:editId="68544C22">
             <wp:extent cx="5274310" cy="3340100"/>
             <wp:effectExtent l="0" t="0" r="2540" b="0"/>
-            <wp:docPr id="1074715592" name="Picture 4"/>
+            <wp:docPr id="1375998579" name="Picture 4"/>
             <wp:cNvGraphicFramePr>
               <a:graphicFrameLocks xmlns:a="http://schemas.openxmlformats.org/drawingml/2006/main" noChangeAspect="1"/>
             </wp:cNvGraphicFramePr>
@@ -506,7 +506,7 @@
               <a:graphicData uri="http://schemas.openxmlformats.org/drawingml/2006/picture">
                 <pic:pic xmlns:pic="http://schemas.openxmlformats.org/drawingml/2006/picture">
                   <pic:nvPicPr>
-                    <pic:cNvPr id="1074715592" name=""/>
+                    <pic:cNvPr id="1375998579" name=""/>
                     <pic:cNvPicPr/>
                   </pic:nvPicPr>
                   <pic:blipFill>
@@ -675,10 +675,10 @@
           <w:noProof/>
         </w:rPr>
         <w:drawing>
-          <wp:inline distT="0" distB="0" distL="0" distR="0" wp14:anchorId="79972C8C" wp14:editId="5695BB31">
+          <wp:inline distT="0" distB="0" distL="0" distR="0" wp14:anchorId="4984582C" wp14:editId="6387B5BF">
             <wp:extent cx="5274310" cy="126365"/>
             <wp:effectExtent l="0" t="0" r="2540" b="6985"/>
-            <wp:docPr id="1740231396" name="Picture 5"/>
+            <wp:docPr id="998911034" name="Picture 5"/>
             <wp:cNvGraphicFramePr>
               <a:graphicFrameLocks xmlns:a="http://schemas.openxmlformats.org/drawingml/2006/main" noChangeAspect="1"/>
             </wp:cNvGraphicFramePr>
@@ -686,7 +686,7 @@
               <a:graphicData uri="http://schemas.openxmlformats.org/drawingml/2006/picture">
                 <pic:pic xmlns:pic="http://schemas.openxmlformats.org/drawingml/2006/picture">
                   <pic:nvPicPr>
-                    <pic:cNvPr id="1740231396" name=""/>
+                    <pic:cNvPr id="998911034" name=""/>
                     <pic:cNvPicPr/>
                   </pic:nvPicPr>
                   <pic:blipFill>
@@ -758,10 +758,10 @@
           <w:noProof/>
         </w:rPr>
         <w:drawing>
-          <wp:inline distT="0" distB="0" distL="0" distR="0" wp14:anchorId="390D81D5" wp14:editId="3F7790C7">
+          <wp:inline distT="0" distB="0" distL="0" distR="0" wp14:anchorId="2338629F" wp14:editId="1BCA939A">
             <wp:extent cx="446690" cy="4318000"/>
             <wp:effectExtent l="0" t="0" r="0" b="6350"/>
-            <wp:docPr id="213602447" name="Picture 6"/>
+            <wp:docPr id="924460819" name="Picture 6"/>
             <wp:cNvGraphicFramePr>
               <a:graphicFrameLocks xmlns:a="http://schemas.openxmlformats.org/drawingml/2006/main" noChangeAspect="1"/>
             </wp:cNvGraphicFramePr>
@@ -769,7 +769,7 @@
               <a:graphicData uri="http://schemas.openxmlformats.org/drawingml/2006/picture">
                 <pic:pic xmlns:pic="http://schemas.openxmlformats.org/drawingml/2006/picture">
                   <pic:nvPicPr>
-                    <pic:cNvPr id="213602447" name=""/>
+                    <pic:cNvPr id="924460819" name=""/>
                     <pic:cNvPicPr/>
                   </pic:nvPicPr>
                   <pic:blipFill>
@@ -1010,10 +1010,10 @@
           <w:noProof/>
         </w:rPr>
         <w:drawing>
-          <wp:inline distT="0" distB="0" distL="0" distR="0" wp14:anchorId="16DF9468" wp14:editId="6C7EC699">
+          <wp:inline distT="0" distB="0" distL="0" distR="0" wp14:anchorId="2926A577" wp14:editId="395741E5">
             <wp:extent cx="5274310" cy="417195"/>
             <wp:effectExtent l="0" t="0" r="2540" b="1905"/>
-            <wp:docPr id="726767948" name="Picture 7"/>
+            <wp:docPr id="2018200348" name="Picture 7"/>
             <wp:cNvGraphicFramePr>
               <a:graphicFrameLocks xmlns:a="http://schemas.openxmlformats.org/drawingml/2006/main" noChangeAspect="1"/>
             </wp:cNvGraphicFramePr>
@@ -1021,7 +1021,7 @@
               <a:graphicData uri="http://schemas.openxmlformats.org/drawingml/2006/picture">
                 <pic:pic xmlns:pic="http://schemas.openxmlformats.org/drawingml/2006/picture">
                   <pic:nvPicPr>
-                    <pic:cNvPr id="726767948" name=""/>
+                    <pic:cNvPr id="2018200348" name=""/>
                     <pic:cNvPicPr/>
                   </pic:nvPicPr>
                   <pic:blipFill>
@@ -1318,10 +1318,10 @@
           <w:noProof/>
         </w:rPr>
         <w:drawing>
-          <wp:inline distT="0" distB="0" distL="0" distR="0" wp14:anchorId="640D889A" wp14:editId="54661D4C">
+          <wp:inline distT="0" distB="0" distL="0" distR="0" wp14:anchorId="0FD37E0B" wp14:editId="2C399D60">
             <wp:extent cx="5274310" cy="502920"/>
             <wp:effectExtent l="0" t="0" r="2540" b="0"/>
-            <wp:docPr id="865013809" name="Picture 8"/>
+            <wp:docPr id="865874829" name="Picture 8"/>
             <wp:cNvGraphicFramePr>
               <a:graphicFrameLocks xmlns:a="http://schemas.openxmlformats.org/drawingml/2006/main" noChangeAspect="1"/>
             </wp:cNvGraphicFramePr>
@@ -1329,7 +1329,7 @@
               <a:graphicData uri="http://schemas.openxmlformats.org/drawingml/2006/picture">
                 <pic:pic xmlns:pic="http://schemas.openxmlformats.org/drawingml/2006/picture">
                   <pic:nvPicPr>
-                    <pic:cNvPr id="865013809" name=""/>
+                    <pic:cNvPr id="865874829" name=""/>
                     <pic:cNvPicPr/>
                   </pic:nvPicPr>
                   <pic:blipFill>
@@ -1606,10 +1606,10 @@
           <w:noProof/>
         </w:rPr>
         <w:drawing>
-          <wp:inline distT="0" distB="0" distL="0" distR="0" wp14:anchorId="78D75EE4" wp14:editId="69AE0797">
+          <wp:inline distT="0" distB="0" distL="0" distR="0" wp14:anchorId="7040AF0A" wp14:editId="528DFD42">
             <wp:extent cx="5274310" cy="763905"/>
             <wp:effectExtent l="0" t="0" r="2540" b="0"/>
-            <wp:docPr id="579124491" name="Picture 9"/>
+            <wp:docPr id="859402455" name="Picture 9"/>
             <wp:cNvGraphicFramePr>
               <a:graphicFrameLocks xmlns:a="http://schemas.openxmlformats.org/drawingml/2006/main" noChangeAspect="1"/>
             </wp:cNvGraphicFramePr>
@@ -1617,7 +1617,7 @@
               <a:graphicData uri="http://schemas.openxmlformats.org/drawingml/2006/picture">
                 <pic:pic xmlns:pic="http://schemas.openxmlformats.org/drawingml/2006/picture">
                   <pic:nvPicPr>
-                    <pic:cNvPr id="579124491" name=""/>
+                    <pic:cNvPr id="859402455" name=""/>
                     <pic:cNvPicPr/>
                   </pic:nvPicPr>
                   <pic:blipFill>
@@ -1693,10 +1693,10 @@
           <w:noProof/>
         </w:rPr>
         <w:drawing>
-          <wp:inline distT="0" distB="0" distL="0" distR="0" wp14:anchorId="6313D320" wp14:editId="17F69490">
+          <wp:inline distT="0" distB="0" distL="0" distR="0" wp14:anchorId="4067B785" wp14:editId="166C4489">
             <wp:extent cx="5274310" cy="1386205"/>
             <wp:effectExtent l="0" t="0" r="2540" b="4445"/>
-            <wp:docPr id="1949336029" name="Picture 10"/>
+            <wp:docPr id="720058402" name="Picture 10"/>
             <wp:cNvGraphicFramePr>
               <a:graphicFrameLocks xmlns:a="http://schemas.openxmlformats.org/drawingml/2006/main" noChangeAspect="1"/>
             </wp:cNvGraphicFramePr>
@@ -1704,7 +1704,7 @@
               <a:graphicData uri="http://schemas.openxmlformats.org/drawingml/2006/picture">
                 <pic:pic xmlns:pic="http://schemas.openxmlformats.org/drawingml/2006/picture">
                   <pic:nvPicPr>
-                    <pic:cNvPr id="1949336029" name=""/>
+                    <pic:cNvPr id="720058402" name=""/>
                     <pic:cNvPicPr/>
                   </pic:nvPicPr>
                   <pic:blipFill>
@@ -1776,10 +1776,10 @@
           <w:noProof/>
         </w:rPr>
         <w:drawing>
-          <wp:inline distT="0" distB="0" distL="0" distR="0" wp14:anchorId="4C67C49E" wp14:editId="5D476B91">
+          <wp:inline distT="0" distB="0" distL="0" distR="0" wp14:anchorId="3CE89E2C" wp14:editId="427B7CB7">
             <wp:extent cx="5274310" cy="3340100"/>
             <wp:effectExtent l="0" t="0" r="2540" b="0"/>
-            <wp:docPr id="1314486896" name="Picture 11"/>
+            <wp:docPr id="404104845" name="Picture 11"/>
             <wp:cNvGraphicFramePr>
               <a:graphicFrameLocks xmlns:a="http://schemas.openxmlformats.org/drawingml/2006/main" noChangeAspect="1"/>
             </wp:cNvGraphicFramePr>
@@ -1787,7 +1787,7 @@
               <a:graphicData uri="http://schemas.openxmlformats.org/drawingml/2006/picture">
                 <pic:pic xmlns:pic="http://schemas.openxmlformats.org/drawingml/2006/picture">
                   <pic:nvPicPr>
-                    <pic:cNvPr id="1314486896" name=""/>
+                    <pic:cNvPr id="404104845" name=""/>
                     <pic:cNvPicPr/>
                   </pic:nvPicPr>
                   <pic:blipFill>
@@ -1836,10 +1836,10 @@
         </w:rPr>
         <w:lastRenderedPageBreak/>
         <w:drawing>
-          <wp:inline distT="0" distB="0" distL="0" distR="0" wp14:anchorId="72EFDBBD" wp14:editId="525ED89E">
-            <wp:extent cx="1524616" cy="1429328"/>
+          <wp:inline distT="0" distB="0" distL="0" distR="0" wp14:anchorId="18B4E03E" wp14:editId="493E0857">
+            <wp:extent cx="1524213" cy="1428949"/>
             <wp:effectExtent l="0" t="0" r="0" b="0"/>
-            <wp:docPr id="928240334" name="Picture 12"/>
+            <wp:docPr id="1460159822" name="Picture 12"/>
             <wp:cNvGraphicFramePr>
               <a:graphicFrameLocks xmlns:a="http://schemas.openxmlformats.org/drawingml/2006/main" noChangeAspect="1"/>
             </wp:cNvGraphicFramePr>
@@ -1847,7 +1847,7 @@
               <a:graphicData uri="http://schemas.openxmlformats.org/drawingml/2006/picture">
                 <pic:pic xmlns:pic="http://schemas.openxmlformats.org/drawingml/2006/picture">
                   <pic:nvPicPr>
-                    <pic:cNvPr id="928240334" name=""/>
+                    <pic:cNvPr id="1460159822" name=""/>
                     <pic:cNvPicPr/>
                   </pic:nvPicPr>
                   <pic:blipFill>
@@ -1865,7 +1865,7 @@
                   <pic:spPr>
                     <a:xfrm>
                       <a:off x="0" y="0"/>
-                      <a:ext cx="1524616" cy="1429328"/>
+                      <a:ext cx="1524213" cy="1428949"/>
                     </a:xfrm>
                     <a:prstGeom prst="rect">
                       <a:avLst/>
@@ -2056,10 +2056,10 @@
           <w:noProof/>
         </w:rPr>
         <w:drawing>
-          <wp:inline distT="0" distB="0" distL="0" distR="0" wp14:anchorId="3E5381A6" wp14:editId="66BD11C6">
-            <wp:extent cx="4716782" cy="343039"/>
+          <wp:inline distT="0" distB="0" distL="0" distR="0" wp14:anchorId="183A80DB" wp14:editId="75F45736">
+            <wp:extent cx="4715533" cy="342948"/>
             <wp:effectExtent l="0" t="0" r="0" b="0"/>
-            <wp:docPr id="256675747" name="Picture 13"/>
+            <wp:docPr id="857134469" name="Picture 13"/>
             <wp:cNvGraphicFramePr>
               <a:graphicFrameLocks xmlns:a="http://schemas.openxmlformats.org/drawingml/2006/main" noChangeAspect="1"/>
             </wp:cNvGraphicFramePr>
@@ -2067,7 +2067,7 @@
               <a:graphicData uri="http://schemas.openxmlformats.org/drawingml/2006/picture">
                 <pic:pic xmlns:pic="http://schemas.openxmlformats.org/drawingml/2006/picture">
                   <pic:nvPicPr>
-                    <pic:cNvPr id="256675747" name=""/>
+                    <pic:cNvPr id="857134469" name=""/>
                     <pic:cNvPicPr/>
                   </pic:nvPicPr>
                   <pic:blipFill>
@@ -2085,7 +2085,7 @@
                   <pic:spPr>
                     <a:xfrm>
                       <a:off x="0" y="0"/>
-                      <a:ext cx="4716782" cy="343039"/>
+                      <a:ext cx="4715533" cy="342948"/>
                     </a:xfrm>
                     <a:prstGeom prst="rect">
                       <a:avLst/>
@@ -2200,10 +2200,10 @@
           <w:noProof/>
         </w:rPr>
         <w:drawing>
-          <wp:inline distT="0" distB="0" distL="0" distR="0" wp14:anchorId="278294E4" wp14:editId="6070AA70">
+          <wp:inline distT="0" distB="0" distL="0" distR="0" wp14:anchorId="19252AE5" wp14:editId="72BFC87E">
             <wp:extent cx="5274310" cy="3340100"/>
             <wp:effectExtent l="0" t="0" r="2540" b="0"/>
-            <wp:docPr id="2132103965" name="Picture 14"/>
+            <wp:docPr id="1353131738" name="Picture 14"/>
             <wp:cNvGraphicFramePr>
               <a:graphicFrameLocks xmlns:a="http://schemas.openxmlformats.org/drawingml/2006/main" noChangeAspect="1"/>
             </wp:cNvGraphicFramePr>
@@ -2211,7 +2211,7 @@
               <a:graphicData uri="http://schemas.openxmlformats.org/drawingml/2006/picture">
                 <pic:pic xmlns:pic="http://schemas.openxmlformats.org/drawingml/2006/picture">
                   <pic:nvPicPr>
-                    <pic:cNvPr id="2132103965" name=""/>
+                    <pic:cNvPr id="1353131738" name=""/>
                     <pic:cNvPicPr/>
                   </pic:nvPicPr>
                   <pic:blipFill>
@@ -2334,10 +2334,10 @@
           <w:noProof/>
         </w:rPr>
         <w:drawing>
-          <wp:inline distT="0" distB="0" distL="0" distR="0" wp14:anchorId="7C882C70" wp14:editId="6755C4ED">
-            <wp:extent cx="5274310" cy="147320"/>
-            <wp:effectExtent l="0" t="0" r="2540" b="5080"/>
-            <wp:docPr id="609392969" name="Picture 15"/>
+          <wp:inline distT="0" distB="0" distL="0" distR="0" wp14:anchorId="1F7C0AE6" wp14:editId="44B8707A">
+            <wp:extent cx="5274310" cy="147955"/>
+            <wp:effectExtent l="0" t="0" r="2540" b="4445"/>
+            <wp:docPr id="652635421" name="Picture 15"/>
             <wp:cNvGraphicFramePr>
               <a:graphicFrameLocks xmlns:a="http://schemas.openxmlformats.org/drawingml/2006/main" noChangeAspect="1"/>
             </wp:cNvGraphicFramePr>
@@ -2345,7 +2345,7 @@
               <a:graphicData uri="http://schemas.openxmlformats.org/drawingml/2006/picture">
                 <pic:pic xmlns:pic="http://schemas.openxmlformats.org/drawingml/2006/picture">
                   <pic:nvPicPr>
-                    <pic:cNvPr id="609392969" name=""/>
+                    <pic:cNvPr id="652635421" name=""/>
                     <pic:cNvPicPr/>
                   </pic:nvPicPr>
                   <pic:blipFill>
@@ -2363,7 +2363,7 @@
                   <pic:spPr>
                     <a:xfrm>
                       <a:off x="0" y="0"/>
-                      <a:ext cx="5274310" cy="147320"/>
+                      <a:ext cx="5274310" cy="147955"/>
                     </a:xfrm>
                     <a:prstGeom prst="rect">
                       <a:avLst/>
@@ -2486,10 +2486,10 @@
           <w:noProof/>
         </w:rPr>
         <w:drawing>
-          <wp:inline distT="0" distB="0" distL="0" distR="0" wp14:anchorId="15A8F291" wp14:editId="187F5111">
+          <wp:inline distT="0" distB="0" distL="0" distR="0" wp14:anchorId="014EA125" wp14:editId="013E0E54">
             <wp:extent cx="5274310" cy="3340100"/>
             <wp:effectExtent l="0" t="0" r="2540" b="0"/>
-            <wp:docPr id="1114825483" name="Picture 16"/>
+            <wp:docPr id="440352563" name="Picture 16"/>
             <wp:cNvGraphicFramePr>
               <a:graphicFrameLocks xmlns:a="http://schemas.openxmlformats.org/drawingml/2006/main" noChangeAspect="1"/>
             </wp:cNvGraphicFramePr>
@@ -2497,7 +2497,7 @@
               <a:graphicData uri="http://schemas.openxmlformats.org/drawingml/2006/picture">
                 <pic:pic xmlns:pic="http://schemas.openxmlformats.org/drawingml/2006/picture">
                   <pic:nvPicPr>
-                    <pic:cNvPr id="1114825483" name=""/>
+                    <pic:cNvPr id="440352563" name=""/>
                     <pic:cNvPicPr/>
                   </pic:nvPicPr>
                   <pic:blipFill>
@@ -2670,10 +2670,10 @@
           <w:noProof/>
         </w:rPr>
         <w:drawing>
-          <wp:inline distT="0" distB="0" distL="0" distR="0" wp14:anchorId="335263A2" wp14:editId="3DBEDE01">
+          <wp:inline distT="0" distB="0" distL="0" distR="0" wp14:anchorId="402A5DA0" wp14:editId="1A43F609">
             <wp:extent cx="5274310" cy="277495"/>
             <wp:effectExtent l="0" t="0" r="2540" b="8255"/>
-            <wp:docPr id="570518971" name="Picture 17"/>
+            <wp:docPr id="2046507830" name="Picture 17"/>
             <wp:cNvGraphicFramePr>
               <a:graphicFrameLocks xmlns:a="http://schemas.openxmlformats.org/drawingml/2006/main" noChangeAspect="1"/>
             </wp:cNvGraphicFramePr>
@@ -2681,7 +2681,7 @@
               <a:graphicData uri="http://schemas.openxmlformats.org/drawingml/2006/picture">
                 <pic:pic xmlns:pic="http://schemas.openxmlformats.org/drawingml/2006/picture">
                   <pic:nvPicPr>
-                    <pic:cNvPr id="570518971" name=""/>
+                    <pic:cNvPr id="2046507830" name=""/>
                     <pic:cNvPicPr/>
                   </pic:nvPicPr>
                   <pic:blipFill>
@@ -3050,7 +3050,7 @@
   <w:abstractNum w:abstractNumId="0" w15:restartNumberingAfterBreak="0">
     <w:nsid w:val="FFFFFF89"/>
     <w:multiLevelType w:val="singleLevel"/>
-    <w:tmpl w:val="913C2C02"/>
+    <w:tmpl w:val="76A86FAA"/>
     <w:lvl w:ilvl="0">
       <w:start w:val="1"/>
       <w:numFmt w:val="bullet"/>
@@ -3068,7 +3068,7 @@
       </w:rPr>
     </w:lvl>
   </w:abstractNum>
-  <w:num w:numId="1" w16cid:durableId="2079664041">
+  <w:num w:numId="1" w16cid:durableId="186874876">
     <w:abstractNumId w:val="0"/>
   </w:num>
 </w:numbering>
@@ -3482,7 +3482,7 @@
     <w:link w:val="Heading1Char"/>
     <w:uiPriority w:val="9"/>
     <w:qFormat/>
-    <w:rsid w:val="0053526C"/>
+    <w:rsid w:val="00437D5E"/>
     <w:pPr>
       <w:keepNext/>
       <w:keepLines/>
@@ -3504,7 +3504,7 @@
     <w:uiPriority w:val="9"/>
     <w:unhideWhenUsed/>
     <w:qFormat/>
-    <w:rsid w:val="0053526C"/>
+    <w:rsid w:val="00437D5E"/>
     <w:pPr>
       <w:keepNext/>
       <w:keepLines/>
@@ -3526,7 +3526,7 @@
     <w:uiPriority w:val="9"/>
     <w:unhideWhenUsed/>
     <w:qFormat/>
-    <w:rsid w:val="0053526C"/>
+    <w:rsid w:val="00437D5E"/>
     <w:pPr>
       <w:keepNext/>
       <w:keepLines/>
@@ -3549,7 +3549,7 @@
     <w:semiHidden/>
     <w:unhideWhenUsed/>
     <w:qFormat/>
-    <w:rsid w:val="0053526C"/>
+    <w:rsid w:val="00437D5E"/>
     <w:pPr>
       <w:keepNext/>
       <w:keepLines/>
@@ -3572,7 +3572,7 @@
     <w:semiHidden/>
     <w:unhideWhenUsed/>
     <w:qFormat/>
-    <w:rsid w:val="0053526C"/>
+    <w:rsid w:val="00437D5E"/>
     <w:pPr>
       <w:keepNext/>
       <w:keepLines/>
@@ -3593,7 +3593,7 @@
     <w:semiHidden/>
     <w:unhideWhenUsed/>
     <w:qFormat/>
-    <w:rsid w:val="0053526C"/>
+    <w:rsid w:val="00437D5E"/>
     <w:pPr>
       <w:keepNext/>
       <w:keepLines/>
@@ -3616,7 +3616,7 @@
     <w:semiHidden/>
     <w:unhideWhenUsed/>
     <w:qFormat/>
-    <w:rsid w:val="0053526C"/>
+    <w:rsid w:val="00437D5E"/>
     <w:pPr>
       <w:keepNext/>
       <w:keepLines/>
@@ -3637,7 +3637,7 @@
     <w:semiHidden/>
     <w:unhideWhenUsed/>
     <w:qFormat/>
-    <w:rsid w:val="0053526C"/>
+    <w:rsid w:val="00437D5E"/>
     <w:pPr>
       <w:keepNext/>
       <w:keepLines/>
@@ -3660,7 +3660,7 @@
     <w:semiHidden/>
     <w:unhideWhenUsed/>
     <w:qFormat/>
-    <w:rsid w:val="0053526C"/>
+    <w:rsid w:val="00437D5E"/>
     <w:pPr>
       <w:keepNext/>
       <w:keepLines/>
@@ -3704,7 +3704,7 @@
     <w:basedOn w:val="DefaultParagraphFont"/>
     <w:link w:val="Heading1"/>
     <w:uiPriority w:val="9"/>
-    <w:rsid w:val="0053526C"/>
+    <w:rsid w:val="00437D5E"/>
     <w:rPr>
       <w:rFonts w:asciiTheme="majorHAnsi" w:eastAsiaTheme="majorEastAsia" w:hAnsiTheme="majorHAnsi" w:cstheme="majorBidi"/>
       <w:color w:val="0F4761" w:themeColor="accent1" w:themeShade="BF"/>
@@ -3717,7 +3717,7 @@
     <w:basedOn w:val="DefaultParagraphFont"/>
     <w:link w:val="Heading2"/>
     <w:uiPriority w:val="9"/>
-    <w:rsid w:val="0053526C"/>
+    <w:rsid w:val="00437D5E"/>
     <w:rPr>
       <w:rFonts w:asciiTheme="majorHAnsi" w:eastAsiaTheme="majorEastAsia" w:hAnsiTheme="majorHAnsi" w:cstheme="majorBidi"/>
       <w:color w:val="0F4761" w:themeColor="accent1" w:themeShade="BF"/>
@@ -3730,7 +3730,7 @@
     <w:basedOn w:val="DefaultParagraphFont"/>
     <w:link w:val="Heading3"/>
     <w:uiPriority w:val="9"/>
-    <w:rsid w:val="0053526C"/>
+    <w:rsid w:val="00437D5E"/>
     <w:rPr>
       <w:rFonts w:eastAsiaTheme="majorEastAsia" w:cstheme="majorBidi"/>
       <w:color w:val="0F4761" w:themeColor="accent1" w:themeShade="BF"/>
@@ -3744,7 +3744,7 @@
     <w:link w:val="Heading4"/>
     <w:uiPriority w:val="9"/>
     <w:semiHidden/>
-    <w:rsid w:val="0053526C"/>
+    <w:rsid w:val="00437D5E"/>
     <w:rPr>
       <w:rFonts w:eastAsiaTheme="majorEastAsia" w:cstheme="majorBidi"/>
       <w:i/>
@@ -3758,7 +3758,7 @@
     <w:link w:val="Heading5"/>
     <w:uiPriority w:val="9"/>
     <w:semiHidden/>
-    <w:rsid w:val="0053526C"/>
+    <w:rsid w:val="00437D5E"/>
     <w:rPr>
       <w:rFonts w:eastAsiaTheme="majorEastAsia" w:cstheme="majorBidi"/>
       <w:color w:val="0F4761" w:themeColor="accent1" w:themeShade="BF"/>
@@ -3770,7 +3770,7 @@
     <w:link w:val="Heading6"/>
     <w:uiPriority w:val="9"/>
     <w:semiHidden/>
-    <w:rsid w:val="0053526C"/>
+    <w:rsid w:val="00437D5E"/>
     <w:rPr>
       <w:rFonts w:eastAsiaTheme="majorEastAsia" w:cstheme="majorBidi"/>
       <w:i/>
@@ -3784,7 +3784,7 @@
     <w:link w:val="Heading7"/>
     <w:uiPriority w:val="9"/>
     <w:semiHidden/>
-    <w:rsid w:val="0053526C"/>
+    <w:rsid w:val="00437D5E"/>
     <w:rPr>
       <w:rFonts w:eastAsiaTheme="majorEastAsia" w:cstheme="majorBidi"/>
       <w:color w:val="595959" w:themeColor="text1" w:themeTint="A6"/>
@@ -3796,7 +3796,7 @@
     <w:link w:val="Heading8"/>
     <w:uiPriority w:val="9"/>
     <w:semiHidden/>
-    <w:rsid w:val="0053526C"/>
+    <w:rsid w:val="00437D5E"/>
     <w:rPr>
       <w:rFonts w:eastAsiaTheme="majorEastAsia" w:cstheme="majorBidi"/>
       <w:i/>
@@ -3810,7 +3810,7 @@
     <w:link w:val="Heading9"/>
     <w:uiPriority w:val="9"/>
     <w:semiHidden/>
-    <w:rsid w:val="0053526C"/>
+    <w:rsid w:val="00437D5E"/>
     <w:rPr>
       <w:rFonts w:eastAsiaTheme="majorEastAsia" w:cstheme="majorBidi"/>
       <w:color w:val="272727" w:themeColor="text1" w:themeTint="D8"/>
@@ -3823,7 +3823,7 @@
     <w:link w:val="TitleChar"/>
     <w:uiPriority w:val="10"/>
     <w:qFormat/>
-    <w:rsid w:val="0053526C"/>
+    <w:rsid w:val="00437D5E"/>
     <w:pPr>
       <w:spacing w:after="80" w:line="240" w:lineRule="auto"/>
       <w:contextualSpacing/>
@@ -3841,7 +3841,7 @@
     <w:basedOn w:val="DefaultParagraphFont"/>
     <w:link w:val="Title"/>
     <w:uiPriority w:val="10"/>
-    <w:rsid w:val="0053526C"/>
+    <w:rsid w:val="00437D5E"/>
     <w:rPr>
       <w:rFonts w:asciiTheme="majorHAnsi" w:eastAsiaTheme="majorEastAsia" w:hAnsiTheme="majorHAnsi" w:cstheme="majorBidi"/>
       <w:spacing w:val="-10"/>
@@ -3857,7 +3857,7 @@
     <w:link w:val="SubtitleChar"/>
     <w:uiPriority w:val="11"/>
     <w:qFormat/>
-    <w:rsid w:val="0053526C"/>
+    <w:rsid w:val="00437D5E"/>
     <w:pPr>
       <w:numPr>
         <w:ilvl w:val="1"/>
@@ -3876,7 +3876,7 @@
     <w:basedOn w:val="DefaultParagraphFont"/>
     <w:link w:val="Subtitle"/>
     <w:uiPriority w:val="11"/>
-    <w:rsid w:val="0053526C"/>
+    <w:rsid w:val="00437D5E"/>
     <w:rPr>
       <w:rFonts w:eastAsiaTheme="majorEastAsia" w:cstheme="majorBidi"/>
       <w:color w:val="595959" w:themeColor="text1" w:themeTint="A6"/>
@@ -3892,7 +3892,7 @@
     <w:link w:val="QuoteChar"/>
     <w:uiPriority w:val="29"/>
     <w:qFormat/>
-    <w:rsid w:val="0053526C"/>
+    <w:rsid w:val="00437D5E"/>
     <w:pPr>
       <w:spacing w:before="160"/>
       <w:jc w:val="center"/>
@@ -3908,7 +3908,7 @@
     <w:basedOn w:val="DefaultParagraphFont"/>
     <w:link w:val="Quote"/>
     <w:uiPriority w:val="29"/>
-    <w:rsid w:val="0053526C"/>
+    <w:rsid w:val="00437D5E"/>
     <w:rPr>
       <w:i/>
       <w:iCs/>
@@ -3920,7 +3920,7 @@
     <w:basedOn w:val="Normal"/>
     <w:uiPriority w:val="34"/>
     <w:qFormat/>
-    <w:rsid w:val="0053526C"/>
+    <w:rsid w:val="00437D5E"/>
     <w:pPr>
       <w:ind w:left="720"/>
       <w:contextualSpacing/>
@@ -3931,7 +3931,7 @@
     <w:basedOn w:val="DefaultParagraphFont"/>
     <w:uiPriority w:val="21"/>
     <w:qFormat/>
-    <w:rsid w:val="0053526C"/>
+    <w:rsid w:val="00437D5E"/>
     <w:rPr>
       <w:i/>
       <w:iCs/>
@@ -3945,7 +3945,7 @@
     <w:link w:val="IntenseQuoteChar"/>
     <w:uiPriority w:val="30"/>
     <w:qFormat/>
-    <w:rsid w:val="0053526C"/>
+    <w:rsid w:val="00437D5E"/>
     <w:pPr>
       <w:pBdr>
         <w:top w:val="single" w:sz="4" w:space="10" w:color="0F4761" w:themeColor="accent1" w:themeShade="BF"/>
@@ -3966,7 +3966,7 @@
     <w:basedOn w:val="DefaultParagraphFont"/>
     <w:link w:val="IntenseQuote"/>
     <w:uiPriority w:val="30"/>
-    <w:rsid w:val="0053526C"/>
+    <w:rsid w:val="00437D5E"/>
     <w:rPr>
       <w:i/>
       <w:iCs/>
@@ -3978,7 +3978,7 @@
     <w:basedOn w:val="DefaultParagraphFont"/>
     <w:uiPriority w:val="32"/>
     <w:qFormat/>
-    <w:rsid w:val="0053526C"/>
+    <w:rsid w:val="00437D5E"/>
     <w:rPr>
       <w:b/>
       <w:bCs/>
@@ -3992,7 +3992,7 @@
     <w:basedOn w:val="Normal"/>
     <w:uiPriority w:val="99"/>
     <w:unhideWhenUsed/>
-    <w:rsid w:val="0053526C"/>
+    <w:rsid w:val="00437D5E"/>
     <w:pPr>
       <w:numPr>
         <w:numId w:val="1"/>

</xml_diff>